<commit_message>
docs: regenerate security report post-fix (5 PASS 1 FAIL 4 REVIEW, 9 vulns remaining) [3.26]
</commit_message>
<xml_diff>
--- a/deliverables/Phase-4-Testing/EDMECA_Security_Audit_Report_2026-03-03.docx
+++ b/deliverables/Phase-4-Testing/EDMECA_Security_Audit_Report_2026-03-03.docx
@@ -254,6 +254,38 @@
                 <w:sz w:val="18"/>
                 <w:szCs w:val="18"/>
               </w:rPr>
+              <w:t xml:space="preserve">5</w:t>
+            </w:r>
+          </w:p>
+        </w:tc>
+      </w:tr>
+      <w:tr>
+        <w:tc>
+          <w:tcPr>
+            <w:tcW w:type="pct" w:w="40%"/>
+            <w:shd w:color="F5F5F5" w:val="solid"/>
+          </w:tcPr>
+          <w:p>
+            <w:r>
+              <w:rPr>
+                <w:sz w:val="18"/>
+                <w:szCs w:val="18"/>
+              </w:rPr>
+              <w:t xml:space="preserve">Tests requiring review / warnings</w:t>
+            </w:r>
+          </w:p>
+        </w:tc>
+        <w:tc>
+          <w:tcPr>
+            <w:tcW w:type="pct" w:w="60%"/>
+            <w:shd w:color="F5F5F5" w:val="solid"/>
+          </w:tcPr>
+          <w:p>
+            <w:r>
+              <w:rPr>
+                <w:sz w:val="18"/>
+                <w:szCs w:val="18"/>
+              </w:rPr>
               <w:t xml:space="preserve">4</w:t>
             </w:r>
           </w:p>
@@ -263,30 +295,30 @@
         <w:tc>
           <w:tcPr>
             <w:tcW w:type="pct" w:w="40%"/>
-            <w:shd w:color="F5F5F5" w:val="solid"/>
-          </w:tcPr>
-          <w:p>
-            <w:r>
-              <w:rPr>
-                <w:sz w:val="18"/>
-                <w:szCs w:val="18"/>
-              </w:rPr>
-              <w:t xml:space="preserve">Tests requiring review / warnings</w:t>
+            <w:shd w:color="FFFFFF" w:val="solid"/>
+          </w:tcPr>
+          <w:p>
+            <w:r>
+              <w:rPr>
+                <w:sz w:val="18"/>
+                <w:szCs w:val="18"/>
+              </w:rPr>
+              <w:t xml:space="preserve">Tests failed</w:t>
             </w:r>
           </w:p>
         </w:tc>
         <w:tc>
           <w:tcPr>
             <w:tcW w:type="pct" w:w="60%"/>
-            <w:shd w:color="F5F5F5" w:val="solid"/>
-          </w:tcPr>
-          <w:p>
-            <w:r>
-              <w:rPr>
-                <w:sz w:val="18"/>
-                <w:szCs w:val="18"/>
-              </w:rPr>
-              <w:t xml:space="preserve">4</w:t>
+            <w:shd w:color="FFFFFF" w:val="solid"/>
+          </w:tcPr>
+          <w:p>
+            <w:r>
+              <w:rPr>
+                <w:sz w:val="18"/>
+                <w:szCs w:val="18"/>
+              </w:rPr>
+              <w:t xml:space="preserve">1</w:t>
             </w:r>
           </w:p>
         </w:tc>
@@ -295,30 +327,30 @@
         <w:tc>
           <w:tcPr>
             <w:tcW w:type="pct" w:w="40%"/>
-            <w:shd w:color="FFFFFF" w:val="solid"/>
-          </w:tcPr>
-          <w:p>
-            <w:r>
-              <w:rPr>
-                <w:sz w:val="18"/>
-                <w:szCs w:val="18"/>
-              </w:rPr>
-              <w:t xml:space="preserve">Tests failed</w:t>
+            <w:shd w:color="F5F5F5" w:val="solid"/>
+          </w:tcPr>
+          <w:p>
+            <w:r>
+              <w:rPr>
+                <w:sz w:val="18"/>
+                <w:szCs w:val="18"/>
+              </w:rPr>
+              <w:t xml:space="preserve">npm audit — Critical</w:t>
             </w:r>
           </w:p>
         </w:tc>
         <w:tc>
           <w:tcPr>
             <w:tcW w:type="pct" w:w="60%"/>
-            <w:shd w:color="FFFFFF" w:val="solid"/>
-          </w:tcPr>
-          <w:p>
-            <w:r>
-              <w:rPr>
-                <w:sz w:val="18"/>
-                <w:szCs w:val="18"/>
-              </w:rPr>
-              <w:t xml:space="preserve">2</w:t>
+            <w:shd w:color="F5F5F5" w:val="solid"/>
+          </w:tcPr>
+          <w:p>
+            <w:r>
+              <w:rPr>
+                <w:sz w:val="18"/>
+                <w:szCs w:val="18"/>
+              </w:rPr>
+              <w:t xml:space="preserve">0</w:t>
             </w:r>
           </w:p>
         </w:tc>
@@ -327,22 +359,86 @@
         <w:tc>
           <w:tcPr>
             <w:tcW w:type="pct" w:w="40%"/>
-            <w:shd w:color="F5F5F5" w:val="solid"/>
-          </w:tcPr>
-          <w:p>
-            <w:r>
-              <w:rPr>
-                <w:sz w:val="18"/>
-                <w:szCs w:val="18"/>
-              </w:rPr>
-              <w:t xml:space="preserve">npm audit — Critical</w:t>
+            <w:shd w:color="FFFFFF" w:val="solid"/>
+          </w:tcPr>
+          <w:p>
+            <w:r>
+              <w:rPr>
+                <w:sz w:val="18"/>
+                <w:szCs w:val="18"/>
+              </w:rPr>
+              <w:t xml:space="preserve">npm audit — High</w:t>
             </w:r>
           </w:p>
         </w:tc>
         <w:tc>
           <w:tcPr>
             <w:tcW w:type="pct" w:w="60%"/>
-            <w:shd w:color="F5F5F5" w:val="solid"/>
+            <w:shd w:color="FFFFFF" w:val="solid"/>
+          </w:tcPr>
+          <w:p>
+            <w:r>
+              <w:rPr>
+                <w:sz w:val="18"/>
+                <w:szCs w:val="18"/>
+              </w:rPr>
+              <w:t xml:space="preserve">6</w:t>
+            </w:r>
+          </w:p>
+        </w:tc>
+      </w:tr>
+      <w:tr>
+        <w:tc>
+          <w:tcPr>
+            <w:tcW w:type="pct" w:w="40%"/>
+            <w:shd w:color="F5F5F5" w:val="solid"/>
+          </w:tcPr>
+          <w:p>
+            <w:r>
+              <w:rPr>
+                <w:sz w:val="18"/>
+                <w:szCs w:val="18"/>
+              </w:rPr>
+              <w:t xml:space="preserve">npm audit — Moderate</w:t>
+            </w:r>
+          </w:p>
+        </w:tc>
+        <w:tc>
+          <w:tcPr>
+            <w:tcW w:type="pct" w:w="60%"/>
+            <w:shd w:color="F5F5F5" w:val="solid"/>
+          </w:tcPr>
+          <w:p>
+            <w:r>
+              <w:rPr>
+                <w:sz w:val="18"/>
+                <w:szCs w:val="18"/>
+              </w:rPr>
+              <w:t xml:space="preserve">3</w:t>
+            </w:r>
+          </w:p>
+        </w:tc>
+      </w:tr>
+      <w:tr>
+        <w:tc>
+          <w:tcPr>
+            <w:tcW w:type="pct" w:w="40%"/>
+            <w:shd w:color="FFFFFF" w:val="solid"/>
+          </w:tcPr>
+          <w:p>
+            <w:r>
+              <w:rPr>
+                <w:sz w:val="18"/>
+                <w:szCs w:val="18"/>
+              </w:rPr>
+              <w:t xml:space="preserve">npm audit — Low</w:t>
+            </w:r>
+          </w:p>
+        </w:tc>
+        <w:tc>
+          <w:tcPr>
+            <w:tcW w:type="pct" w:w="60%"/>
+            <w:shd w:color="FFFFFF" w:val="solid"/>
           </w:tcPr>
           <w:p>
             <w:r>
@@ -359,30 +455,30 @@
         <w:tc>
           <w:tcPr>
             <w:tcW w:type="pct" w:w="40%"/>
-            <w:shd w:color="FFFFFF" w:val="solid"/>
-          </w:tcPr>
-          <w:p>
-            <w:r>
-              <w:rPr>
-                <w:sz w:val="18"/>
-                <w:szCs w:val="18"/>
-              </w:rPr>
-              <w:t xml:space="preserve">npm audit — High</w:t>
+            <w:shd w:color="F5F5F5" w:val="solid"/>
+          </w:tcPr>
+          <w:p>
+            <w:r>
+              <w:rPr>
+                <w:sz w:val="18"/>
+                <w:szCs w:val="18"/>
+              </w:rPr>
+              <w:t xml:space="preserve">Source files scanned</w:t>
             </w:r>
           </w:p>
         </w:tc>
         <w:tc>
           <w:tcPr>
             <w:tcW w:type="pct" w:w="60%"/>
-            <w:shd w:color="FFFFFF" w:val="solid"/>
-          </w:tcPr>
-          <w:p>
-            <w:r>
-              <w:rPr>
-                <w:sz w:val="18"/>
-                <w:szCs w:val="18"/>
-              </w:rPr>
-              <w:t xml:space="preserve">9</w:t>
+            <w:shd w:color="F5F5F5" w:val="solid"/>
+          </w:tcPr>
+          <w:p>
+            <w:r>
+              <w:rPr>
+                <w:sz w:val="18"/>
+                <w:szCs w:val="18"/>
+              </w:rPr>
+              <w:t xml:space="preserve">89</w:t>
             </w:r>
           </w:p>
         </w:tc>
@@ -391,126 +487,30 @@
         <w:tc>
           <w:tcPr>
             <w:tcW w:type="pct" w:w="40%"/>
-            <w:shd w:color="F5F5F5" w:val="solid"/>
-          </w:tcPr>
-          <w:p>
-            <w:r>
-              <w:rPr>
-                <w:sz w:val="18"/>
-                <w:szCs w:val="18"/>
-              </w:rPr>
-              <w:t xml:space="preserve">npm audit — Moderate</w:t>
+            <w:shd w:color="FFFFFF" w:val="solid"/>
+          </w:tcPr>
+          <w:p>
+            <w:r>
+              <w:rPr>
+                <w:sz w:val="18"/>
+                <w:szCs w:val="18"/>
+              </w:rPr>
+              <w:t xml:space="preserve">Assessment timestamp</w:t>
             </w:r>
           </w:p>
         </w:tc>
         <w:tc>
           <w:tcPr>
             <w:tcW w:type="pct" w:w="60%"/>
-            <w:shd w:color="F5F5F5" w:val="solid"/>
-          </w:tcPr>
-          <w:p>
-            <w:r>
-              <w:rPr>
-                <w:sz w:val="18"/>
-                <w:szCs w:val="18"/>
-              </w:rPr>
-              <w:t xml:space="preserve">4</w:t>
-            </w:r>
-          </w:p>
-        </w:tc>
-      </w:tr>
-      <w:tr>
-        <w:tc>
-          <w:tcPr>
-            <w:tcW w:type="pct" w:w="40%"/>
-            <w:shd w:color="FFFFFF" w:val="solid"/>
-          </w:tcPr>
-          <w:p>
-            <w:r>
-              <w:rPr>
-                <w:sz w:val="18"/>
-                <w:szCs w:val="18"/>
-              </w:rPr>
-              <w:t xml:space="preserve">npm audit — Low</w:t>
-            </w:r>
-          </w:p>
-        </w:tc>
-        <w:tc>
-          <w:tcPr>
-            <w:tcW w:type="pct" w:w="60%"/>
-            <w:shd w:color="FFFFFF" w:val="solid"/>
-          </w:tcPr>
-          <w:p>
-            <w:r>
-              <w:rPr>
-                <w:sz w:val="18"/>
-                <w:szCs w:val="18"/>
-              </w:rPr>
-              <w:t xml:space="preserve">1</w:t>
-            </w:r>
-          </w:p>
-        </w:tc>
-      </w:tr>
-      <w:tr>
-        <w:tc>
-          <w:tcPr>
-            <w:tcW w:type="pct" w:w="40%"/>
-            <w:shd w:color="F5F5F5" w:val="solid"/>
-          </w:tcPr>
-          <w:p>
-            <w:r>
-              <w:rPr>
-                <w:sz w:val="18"/>
-                <w:szCs w:val="18"/>
-              </w:rPr>
-              <w:t xml:space="preserve">Source files scanned</w:t>
-            </w:r>
-          </w:p>
-        </w:tc>
-        <w:tc>
-          <w:tcPr>
-            <w:tcW w:type="pct" w:w="60%"/>
-            <w:shd w:color="F5F5F5" w:val="solid"/>
-          </w:tcPr>
-          <w:p>
-            <w:r>
-              <w:rPr>
-                <w:sz w:val="18"/>
-                <w:szCs w:val="18"/>
-              </w:rPr>
-              <w:t xml:space="preserve">89</w:t>
-            </w:r>
-          </w:p>
-        </w:tc>
-      </w:tr>
-      <w:tr>
-        <w:tc>
-          <w:tcPr>
-            <w:tcW w:type="pct" w:w="40%"/>
-            <w:shd w:color="FFFFFF" w:val="solid"/>
-          </w:tcPr>
-          <w:p>
-            <w:r>
-              <w:rPr>
-                <w:sz w:val="18"/>
-                <w:szCs w:val="18"/>
-              </w:rPr>
-              <w:t xml:space="preserve">Assessment timestamp</w:t>
-            </w:r>
-          </w:p>
-        </w:tc>
-        <w:tc>
-          <w:tcPr>
-            <w:tcW w:type="pct" w:w="60%"/>
-            <w:shd w:color="FFFFFF" w:val="solid"/>
-          </w:tcPr>
-          <w:p>
-            <w:r>
-              <w:rPr>
-                <w:sz w:val="18"/>
-                <w:szCs w:val="18"/>
-              </w:rPr>
-              <w:t xml:space="preserve">2026-03-03T16:23:49.352Z</w:t>
+            <w:shd w:color="FFFFFF" w:val="solid"/>
+          </w:tcPr>
+          <w:p>
+            <w:r>
+              <w:rPr>
+                <w:sz w:val="18"/>
+                <w:szCs w:val="18"/>
+              </w:rPr>
+              <w:t xml:space="preserve">2026-03-03T16:39:11.292Z</w:t>
             </w:r>
           </w:p>
         </w:tc>
@@ -5380,7 +5380,7 @@
         <w:spacing w:after="120"/>
       </w:pPr>
       <w:r>
-        <w:t xml:space="preserve">npm audit found 0 critical, 9 high, 4 moderate, 1 low severity vulnerability/vulnerabilities across 18 advisories. Key affected packages: xlsx (no fix available — Prototype Pollution, ReDoS), rollup (Arbitrary File Write — fix available), tar (File Read/Write — fix available).</w:t>
+        <w:t xml:space="preserve">npm audit found 0 critical, 6 high, 3 moderate, 0 low severity vulnerability/vulnerabilities across 10 advisories. Key affected packages: xlsx (no fix available — Prototype Pollution, ReDoS), rollup (Arbitrary File Write — fix available), tar (File Read/Write — fix available).</w:t>
       </w:r>
     </w:p>
     <w:p>
@@ -5526,7 +5526,7 @@
                 <w:sz w:val="16"/>
                 <w:szCs w:val="16"/>
               </w:rPr>
-              <w:t xml:space="preserve">node_modules/lodash</w:t>
+              <w:t xml:space="preserve">node_modules/minimatch</w:t>
             </w:r>
           </w:p>
         </w:tc>
@@ -5555,7 +5555,7 @@
                 <w:sz w:val="16"/>
                 <w:szCs w:val="16"/>
               </w:rPr>
-              <w:t xml:space="preserve">[MODERATE] Lodash has Prototype Pollution Vulnerability in `_.unset` and `_.omit` functions — &gt;=4.0.0 &lt;=4.17.22</w:t>
+              <w:t xml:space="preserve">[HIGH] minimatch has a ReDoS via repeated wildcards with non-matching literal in pattern — &gt;=10.0.0 &lt;10.2.1</w:t>
             </w:r>
           </w:p>
         </w:tc>
@@ -5601,7 +5601,7 @@
                 <w:sz w:val="16"/>
                 <w:szCs w:val="16"/>
               </w:rPr>
-              <w:t xml:space="preserve">[HIGH] minimatch has a ReDoS via repeated wildcards with non-matching literal in pattern — &gt;=9.0.0 &lt;9.0.6</w:t>
+              <w:t xml:space="preserve">[HIGH] minimatch has ReDoS: matchOne() combinatorial backtracking via multiple non-adjacent GLOBSTAR segments — &gt;=10.0.0 &lt;10.2.3</w:t>
             </w:r>
           </w:p>
         </w:tc>
@@ -5647,7 +5647,7 @@
                 <w:sz w:val="16"/>
                 <w:szCs w:val="16"/>
               </w:rPr>
-              <w:t xml:space="preserve">[HIGH] minimatch has a ReDoS via repeated wildcards with non-matching literal in pattern — &gt;=10.0.0 &lt;10.2.1</w:t>
+              <w:t xml:space="preserve">[HIGH] minimatch ReDoS: nested *() extglobs generate catastrophically backtracking regular expressions — &gt;=10.0.0 &lt;10.2.3</w:t>
             </w:r>
           </w:p>
         </w:tc>
@@ -5664,7 +5664,7 @@
                 <w:sz w:val="16"/>
                 <w:szCs w:val="16"/>
               </w:rPr>
-              <w:t xml:space="preserve">node_modules/minimatch</w:t>
+              <w:t xml:space="preserve">node_modules/path-to-regexp</w:t>
             </w:r>
           </w:p>
         </w:tc>
@@ -5693,375 +5693,7 @@
                 <w:sz w:val="16"/>
                 <w:szCs w:val="16"/>
               </w:rPr>
-              <w:t xml:space="preserve">[HIGH] minimatch has ReDoS: matchOne() combinatorial backtracking via multiple non-adjacent GLOBSTAR segments — &gt;=9.0.0 &lt;9.0.7</w:t>
-            </w:r>
-          </w:p>
-        </w:tc>
-      </w:tr>
-      <w:tr>
-        <w:tc>
-          <w:tcPr>
-            <w:shd w:color="FFFFFF" w:val="solid"/>
-          </w:tcPr>
-          <w:p>
-            <w:r>
-              <w:rPr>
-                <w:rFonts w:ascii="Courier New" w:cs="Courier New" w:eastAsia="Courier New" w:hAnsi="Courier New"/>
-                <w:sz w:val="16"/>
-                <w:szCs w:val="16"/>
-              </w:rPr>
-              <w:t xml:space="preserve">node_modules/minimatch</w:t>
-            </w:r>
-          </w:p>
-        </w:tc>
-        <w:tc>
-          <w:tcPr>
-            <w:shd w:color="FFFFFF" w:val="solid"/>
-          </w:tcPr>
-          <w:p>
-            <w:r>
-              <w:rPr>
-                <w:sz w:val="16"/>
-                <w:szCs w:val="16"/>
-              </w:rPr>
-              <w:t xml:space="preserve">-</w:t>
-            </w:r>
-          </w:p>
-        </w:tc>
-        <w:tc>
-          <w:tcPr>
-            <w:shd w:color="FFFFFF" w:val="solid"/>
-          </w:tcPr>
-          <w:p>
-            <w:r>
-              <w:rPr>
-                <w:rFonts w:ascii="Courier New" w:cs="Courier New" w:eastAsia="Courier New" w:hAnsi="Courier New"/>
-                <w:sz w:val="16"/>
-                <w:szCs w:val="16"/>
-              </w:rPr>
-              <w:t xml:space="preserve">[HIGH] minimatch has ReDoS: matchOne() combinatorial backtracking via multiple non-adjacent GLOBSTAR segments — &gt;=10.0.0 &lt;10.2.3</w:t>
-            </w:r>
-          </w:p>
-        </w:tc>
-      </w:tr>
-      <w:tr>
-        <w:tc>
-          <w:tcPr>
-            <w:shd w:color="F0F0F0" w:val="solid"/>
-          </w:tcPr>
-          <w:p>
-            <w:r>
-              <w:rPr>
-                <w:rFonts w:ascii="Courier New" w:cs="Courier New" w:eastAsia="Courier New" w:hAnsi="Courier New"/>
-                <w:sz w:val="16"/>
-                <w:szCs w:val="16"/>
-              </w:rPr>
-              <w:t xml:space="preserve">node_modules/minimatch</w:t>
-            </w:r>
-          </w:p>
-        </w:tc>
-        <w:tc>
-          <w:tcPr>
-            <w:shd w:color="F0F0F0" w:val="solid"/>
-          </w:tcPr>
-          <w:p>
-            <w:r>
-              <w:rPr>
-                <w:sz w:val="16"/>
-                <w:szCs w:val="16"/>
-              </w:rPr>
-              <w:t xml:space="preserve">-</w:t>
-            </w:r>
-          </w:p>
-        </w:tc>
-        <w:tc>
-          <w:tcPr>
-            <w:shd w:color="F0F0F0" w:val="solid"/>
-          </w:tcPr>
-          <w:p>
-            <w:r>
-              <w:rPr>
-                <w:rFonts w:ascii="Courier New" w:cs="Courier New" w:eastAsia="Courier New" w:hAnsi="Courier New"/>
-                <w:sz w:val="16"/>
-                <w:szCs w:val="16"/>
-              </w:rPr>
-              <w:t xml:space="preserve">[HIGH] minimatch ReDoS: nested *() extglobs generate catastrophically backtracking regular expressions — &lt;3.1.4</w:t>
-            </w:r>
-          </w:p>
-        </w:tc>
-      </w:tr>
-      <w:tr>
-        <w:tc>
-          <w:tcPr>
-            <w:shd w:color="FFFFFF" w:val="solid"/>
-          </w:tcPr>
-          <w:p>
-            <w:r>
-              <w:rPr>
-                <w:rFonts w:ascii="Courier New" w:cs="Courier New" w:eastAsia="Courier New" w:hAnsi="Courier New"/>
-                <w:sz w:val="16"/>
-                <w:szCs w:val="16"/>
-              </w:rPr>
-              <w:t xml:space="preserve">node_modules/minimatch</w:t>
-            </w:r>
-          </w:p>
-        </w:tc>
-        <w:tc>
-          <w:tcPr>
-            <w:shd w:color="FFFFFF" w:val="solid"/>
-          </w:tcPr>
-          <w:p>
-            <w:r>
-              <w:rPr>
-                <w:sz w:val="16"/>
-                <w:szCs w:val="16"/>
-              </w:rPr>
-              <w:t xml:space="preserve">-</w:t>
-            </w:r>
-          </w:p>
-        </w:tc>
-        <w:tc>
-          <w:tcPr>
-            <w:shd w:color="FFFFFF" w:val="solid"/>
-          </w:tcPr>
-          <w:p>
-            <w:r>
-              <w:rPr>
-                <w:rFonts w:ascii="Courier New" w:cs="Courier New" w:eastAsia="Courier New" w:hAnsi="Courier New"/>
-                <w:sz w:val="16"/>
-                <w:szCs w:val="16"/>
-              </w:rPr>
-              <w:t xml:space="preserve">[HIGH] minimatch ReDoS: nested *() extglobs generate catastrophically backtracking regular expressions — &gt;=9.0.0 &lt;9.0.7</w:t>
-            </w:r>
-          </w:p>
-        </w:tc>
-      </w:tr>
-      <w:tr>
-        <w:tc>
-          <w:tcPr>
-            <w:shd w:color="F0F0F0" w:val="solid"/>
-          </w:tcPr>
-          <w:p>
-            <w:r>
-              <w:rPr>
-                <w:rFonts w:ascii="Courier New" w:cs="Courier New" w:eastAsia="Courier New" w:hAnsi="Courier New"/>
-                <w:sz w:val="16"/>
-                <w:szCs w:val="16"/>
-              </w:rPr>
-              <w:t xml:space="preserve">node_modules/minimatch</w:t>
-            </w:r>
-          </w:p>
-        </w:tc>
-        <w:tc>
-          <w:tcPr>
-            <w:shd w:color="F0F0F0" w:val="solid"/>
-          </w:tcPr>
-          <w:p>
-            <w:r>
-              <w:rPr>
-                <w:sz w:val="16"/>
-                <w:szCs w:val="16"/>
-              </w:rPr>
-              <w:t xml:space="preserve">-</w:t>
-            </w:r>
-          </w:p>
-        </w:tc>
-        <w:tc>
-          <w:tcPr>
-            <w:shd w:color="F0F0F0" w:val="solid"/>
-          </w:tcPr>
-          <w:p>
-            <w:r>
-              <w:rPr>
-                <w:rFonts w:ascii="Courier New" w:cs="Courier New" w:eastAsia="Courier New" w:hAnsi="Courier New"/>
-                <w:sz w:val="16"/>
-                <w:szCs w:val="16"/>
-              </w:rPr>
-              <w:t xml:space="preserve">[HIGH] minimatch ReDoS: nested *() extglobs generate catastrophically backtracking regular expressions — &gt;=10.0.0 &lt;10.2.3</w:t>
-            </w:r>
-          </w:p>
-        </w:tc>
-      </w:tr>
-      <w:tr>
-        <w:tc>
-          <w:tcPr>
-            <w:shd w:color="FFFFFF" w:val="solid"/>
-          </w:tcPr>
-          <w:p>
-            <w:r>
-              <w:rPr>
-                <w:rFonts w:ascii="Courier New" w:cs="Courier New" w:eastAsia="Courier New" w:hAnsi="Courier New"/>
-                <w:sz w:val="16"/>
-                <w:szCs w:val="16"/>
-              </w:rPr>
-              <w:t xml:space="preserve">node_modules/path-to-regexp</w:t>
-            </w:r>
-          </w:p>
-        </w:tc>
-        <w:tc>
-          <w:tcPr>
-            <w:shd w:color="FFFFFF" w:val="solid"/>
-          </w:tcPr>
-          <w:p>
-            <w:r>
-              <w:rPr>
-                <w:sz w:val="16"/>
-                <w:szCs w:val="16"/>
-              </w:rPr>
-              <w:t xml:space="preserve">-</w:t>
-            </w:r>
-          </w:p>
-        </w:tc>
-        <w:tc>
-          <w:tcPr>
-            <w:shd w:color="FFFFFF" w:val="solid"/>
-          </w:tcPr>
-          <w:p>
-            <w:r>
-              <w:rPr>
-                <w:rFonts w:ascii="Courier New" w:cs="Courier New" w:eastAsia="Courier New" w:hAnsi="Courier New"/>
-                <w:sz w:val="16"/>
-                <w:szCs w:val="16"/>
-              </w:rPr>
               <w:t xml:space="preserve">[HIGH] path-to-regexp outputs backtracking regular expressions — &gt;=4.0.0 &lt;6.3.0</w:t>
-            </w:r>
-          </w:p>
-        </w:tc>
-      </w:tr>
-      <w:tr>
-        <w:tc>
-          <w:tcPr>
-            <w:shd w:color="F0F0F0" w:val="solid"/>
-          </w:tcPr>
-          <w:p>
-            <w:r>
-              <w:rPr>
-                <w:rFonts w:ascii="Courier New" w:cs="Courier New" w:eastAsia="Courier New" w:hAnsi="Courier New"/>
-                <w:sz w:val="16"/>
-                <w:szCs w:val="16"/>
-              </w:rPr>
-              <w:t xml:space="preserve">node_modules/qs</w:t>
-            </w:r>
-          </w:p>
-        </w:tc>
-        <w:tc>
-          <w:tcPr>
-            <w:shd w:color="F0F0F0" w:val="solid"/>
-          </w:tcPr>
-          <w:p>
-            <w:r>
-              <w:rPr>
-                <w:sz w:val="16"/>
-                <w:szCs w:val="16"/>
-              </w:rPr>
-              <w:t xml:space="preserve">-</w:t>
-            </w:r>
-          </w:p>
-        </w:tc>
-        <w:tc>
-          <w:tcPr>
-            <w:shd w:color="F0F0F0" w:val="solid"/>
-          </w:tcPr>
-          <w:p>
-            <w:r>
-              <w:rPr>
-                <w:rFonts w:ascii="Courier New" w:cs="Courier New" w:eastAsia="Courier New" w:hAnsi="Courier New"/>
-                <w:sz w:val="16"/>
-                <w:szCs w:val="16"/>
-              </w:rPr>
-              <w:t xml:space="preserve">[LOW] qs's arrayLimit bypass in comma parsing allows denial of service — &gt;=6.7.0 &lt;=6.14.1</w:t>
-            </w:r>
-          </w:p>
-        </w:tc>
-      </w:tr>
-      <w:tr>
-        <w:tc>
-          <w:tcPr>
-            <w:shd w:color="FFFFFF" w:val="solid"/>
-          </w:tcPr>
-          <w:p>
-            <w:r>
-              <w:rPr>
-                <w:rFonts w:ascii="Courier New" w:cs="Courier New" w:eastAsia="Courier New" w:hAnsi="Courier New"/>
-                <w:sz w:val="16"/>
-                <w:szCs w:val="16"/>
-              </w:rPr>
-              <w:t xml:space="preserve">node_modules/rollup</w:t>
-            </w:r>
-          </w:p>
-        </w:tc>
-        <w:tc>
-          <w:tcPr>
-            <w:shd w:color="FFFFFF" w:val="solid"/>
-          </w:tcPr>
-          <w:p>
-            <w:r>
-              <w:rPr>
-                <w:sz w:val="16"/>
-                <w:szCs w:val="16"/>
-              </w:rPr>
-              <w:t xml:space="preserve">-</w:t>
-            </w:r>
-          </w:p>
-        </w:tc>
-        <w:tc>
-          <w:tcPr>
-            <w:shd w:color="FFFFFF" w:val="solid"/>
-          </w:tcPr>
-          <w:p>
-            <w:r>
-              <w:rPr>
-                <w:rFonts w:ascii="Courier New" w:cs="Courier New" w:eastAsia="Courier New" w:hAnsi="Courier New"/>
-                <w:sz w:val="16"/>
-                <w:szCs w:val="16"/>
-              </w:rPr>
-              <w:t xml:space="preserve">[HIGH] Rollup 4 has Arbitrary File Write via Path Traversal — &gt;=4.0.0 &lt;4.59.0</w:t>
-            </w:r>
-          </w:p>
-        </w:tc>
-      </w:tr>
-      <w:tr>
-        <w:tc>
-          <w:tcPr>
-            <w:shd w:color="F0F0F0" w:val="solid"/>
-          </w:tcPr>
-          <w:p>
-            <w:r>
-              <w:rPr>
-                <w:rFonts w:ascii="Courier New" w:cs="Courier New" w:eastAsia="Courier New" w:hAnsi="Courier New"/>
-                <w:sz w:val="16"/>
-                <w:szCs w:val="16"/>
-              </w:rPr>
-              <w:t xml:space="preserve">node_modules/tar</w:t>
-            </w:r>
-          </w:p>
-        </w:tc>
-        <w:tc>
-          <w:tcPr>
-            <w:shd w:color="F0F0F0" w:val="solid"/>
-          </w:tcPr>
-          <w:p>
-            <w:r>
-              <w:rPr>
-                <w:sz w:val="16"/>
-                <w:szCs w:val="16"/>
-              </w:rPr>
-              <w:t xml:space="preserve">-</w:t>
-            </w:r>
-          </w:p>
-        </w:tc>
-        <w:tc>
-          <w:tcPr>
-            <w:shd w:color="F0F0F0" w:val="solid"/>
-          </w:tcPr>
-          <w:p>
-            <w:r>
-              <w:rPr>
-                <w:rFonts w:ascii="Courier New" w:cs="Courier New" w:eastAsia="Courier New" w:hAnsi="Courier New"/>
-                <w:sz w:val="16"/>
-                <w:szCs w:val="16"/>
-              </w:rPr>
-              <w:t xml:space="preserve">[HIGH] Arbitrary File Read/Write via Hardlink Target Escape Through Symlink Chain in node-tar Extraction — &lt;7.5.8</w:t>
             </w:r>
           </w:p>
         </w:tc>
@@ -6330,7 +5962,7 @@
     </w:p>
     <w:p>
       <w:pPr>
-        <w:shd w:color="C0392B" w:val="solid"/>
+        <w:shd w:color="27AE60" w:val="solid"/>
         <w:spacing w:before="300" w:after="0"/>
         <w:ind w:left="100" w:right="100"/>
       </w:pPr>
@@ -6352,7 +5984,7 @@
           <w:sz w:val="20"/>
           <w:szCs w:val="20"/>
         </w:rPr>
-        <w:t xml:space="preserve">   [FAIL]  Risk: Medium</w:t>
+        <w:t xml:space="preserve">   [PASS]  Risk: None</w:t>
       </w:r>
     </w:p>
     <w:tbl>
@@ -6535,7 +6167,7 @@
                 <w:sz w:val="18"/>
                 <w:szCs w:val="18"/>
               </w:rPr>
-              <w:t xml:space="preserve">FAIL</w:t>
+              <w:t xml:space="preserve">PASS</w:t>
             </w:r>
           </w:p>
         </w:tc>
@@ -6567,7 +6199,7 @@
                 <w:sz w:val="18"/>
                 <w:szCs w:val="18"/>
               </w:rPr>
-              <w:t xml:space="preserve">Medium</w:t>
+              <w:t xml:space="preserve">None</w:t>
             </w:r>
           </w:p>
         </w:tc>
@@ -6615,7 +6247,7 @@
         <w:spacing w:after="120"/>
       </w:pPr>
       <w:r>
-        <w:t xml:space="preserve">Content-Security-Policy: NOT CONFIGURED. Strict-Transport-Security (HSTS): NOT CONFIGURED. X-Frame-Options: Present.</w:t>
+        <w:t xml:space="preserve">Content-Security-Policy: Present. Strict-Transport-Security (HSTS): Present. X-Frame-Options: Present.</w:t>
       </w:r>
     </w:p>
     <w:p>
@@ -6704,7 +6336,7 @@
         <w:spacing w:after="120"/>
       </w:pPr>
       <w:r>
-        <w:t xml:space="preserve">npm audit identified 18 advisory entries across 14 affected packages. Full detail below:</w:t>
+        <w:t xml:space="preserve">npm audit identified 10 advisory entries across 9 affected packages. Full detail below:</w:t>
       </w:r>
     </w:p>
     <w:p>
@@ -6915,7 +6547,7 @@
                 <w:sz w:val="18"/>
                 <w:szCs w:val="18"/>
               </w:rPr>
-              <w:t xml:space="preserve">lodash</w:t>
+              <w:t xml:space="preserve">minimatch</w:t>
             </w:r>
           </w:p>
         </w:tc>
@@ -6930,7 +6562,7 @@
                 <w:sz w:val="18"/>
                 <w:szCs w:val="18"/>
               </w:rPr>
-              <w:t xml:space="preserve">MODERATE</w:t>
+              <w:t xml:space="preserve">HIGH</w:t>
             </w:r>
           </w:p>
         </w:tc>
@@ -6945,7 +6577,7 @@
                 <w:sz w:val="18"/>
                 <w:szCs w:val="18"/>
               </w:rPr>
-              <w:t xml:space="preserve">Lodash has Prototype Pollution Vulnerability in `_.unset` an</w:t>
+              <w:t xml:space="preserve">minimatch has a ReDoS via repeated wildcards with non-matchi</w:t>
             </w:r>
           </w:p>
         </w:tc>
@@ -6960,7 +6592,7 @@
                 <w:sz w:val="18"/>
                 <w:szCs w:val="18"/>
               </w:rPr>
-              <w:t xml:space="preserve">&gt;=4.0.0 &lt;=4.17.22</w:t>
+              <w:t xml:space="preserve">&gt;=10.0.0 &lt;10.2.1</w:t>
             </w:r>
           </w:p>
         </w:tc>
@@ -6975,7 +6607,7 @@
                 <w:sz w:val="18"/>
                 <w:szCs w:val="18"/>
               </w:rPr>
-              <w:t xml:space="preserve">Yes (run npm audit fix)</w:t>
+              <w:t xml:space="preserve">Upgrade @vercel/node to 4.0.0</w:t>
             </w:r>
           </w:p>
         </w:tc>
@@ -7022,7 +6654,7 @@
                 <w:sz w:val="18"/>
                 <w:szCs w:val="18"/>
               </w:rPr>
-              <w:t xml:space="preserve">minimatch has a ReDoS via repeated wildcards with non-matchi</w:t>
+              <w:t xml:space="preserve">minimatch has ReDoS: matchOne() combinatorial backtracking v</w:t>
             </w:r>
           </w:p>
         </w:tc>
@@ -7037,7 +6669,7 @@
                 <w:sz w:val="18"/>
                 <w:szCs w:val="18"/>
               </w:rPr>
-              <w:t xml:space="preserve">&gt;=9.0.0 &lt;9.0.6</w:t>
+              <w:t xml:space="preserve">&gt;=10.0.0 &lt;10.2.3</w:t>
             </w:r>
           </w:p>
         </w:tc>
@@ -7099,7 +6731,7 @@
                 <w:sz w:val="18"/>
                 <w:szCs w:val="18"/>
               </w:rPr>
-              <w:t xml:space="preserve">minimatch has a ReDoS via repeated wildcards with non-matchi</w:t>
+              <w:t xml:space="preserve">minimatch ReDoS: nested *() extglobs generate catastrophical</w:t>
             </w:r>
           </w:p>
         </w:tc>
@@ -7114,7 +6746,7 @@
                 <w:sz w:val="18"/>
                 <w:szCs w:val="18"/>
               </w:rPr>
-              <w:t xml:space="preserve">&gt;=10.0.0 &lt;10.2.1</w:t>
+              <w:t xml:space="preserve">&gt;=10.0.0 &lt;10.2.3</w:t>
             </w:r>
           </w:p>
         </w:tc>
@@ -7146,7 +6778,7 @@
                 <w:sz w:val="18"/>
                 <w:szCs w:val="18"/>
               </w:rPr>
-              <w:t xml:space="preserve">minimatch</w:t>
+              <w:t xml:space="preserve">path-to-regexp</w:t>
             </w:r>
           </w:p>
         </w:tc>
@@ -7176,7 +6808,7 @@
                 <w:sz w:val="18"/>
                 <w:szCs w:val="18"/>
               </w:rPr>
-              <w:t xml:space="preserve">minimatch has ReDoS: matchOne() combinatorial backtracking v</w:t>
+              <w:t xml:space="preserve">path-to-regexp outputs backtracking regular expressions</w:t>
             </w:r>
           </w:p>
         </w:tc>
@@ -7191,7 +6823,7 @@
                 <w:sz w:val="18"/>
                 <w:szCs w:val="18"/>
               </w:rPr>
-              <w:t xml:space="preserve">&gt;=9.0.0 &lt;9.0.7</w:t>
+              <w:t xml:space="preserve">&gt;=4.0.0 &lt;6.3.0</w:t>
             </w:r>
           </w:p>
         </w:tc>
@@ -7207,622 +6839,6 @@
                 <w:szCs w:val="18"/>
               </w:rPr>
               <w:t xml:space="preserve">Upgrade @vercel/node to 4.0.0</w:t>
-            </w:r>
-          </w:p>
-        </w:tc>
-      </w:tr>
-      <w:tr>
-        <w:tc>
-          <w:tcPr>
-            <w:tcW w:type="pct" w:w="15%"/>
-            <w:shd w:color="FFFFFF" w:val="solid"/>
-          </w:tcPr>
-          <w:p>
-            <w:r>
-              <w:rPr>
-                <w:sz w:val="18"/>
-                <w:szCs w:val="18"/>
-              </w:rPr>
-              <w:t xml:space="preserve">minimatch</w:t>
-            </w:r>
-          </w:p>
-        </w:tc>
-        <w:tc>
-          <w:tcPr>
-            <w:tcW w:type="pct" w:w="10%"/>
-            <w:shd w:color="FFFFFF" w:val="solid"/>
-          </w:tcPr>
-          <w:p>
-            <w:r>
-              <w:rPr>
-                <w:sz w:val="18"/>
-                <w:szCs w:val="18"/>
-              </w:rPr>
-              <w:t xml:space="preserve">HIGH</w:t>
-            </w:r>
-          </w:p>
-        </w:tc>
-        <w:tc>
-          <w:tcPr>
-            <w:tcW w:type="pct" w:w="35%"/>
-            <w:shd w:color="FFFFFF" w:val="solid"/>
-          </w:tcPr>
-          <w:p>
-            <w:r>
-              <w:rPr>
-                <w:sz w:val="18"/>
-                <w:szCs w:val="18"/>
-              </w:rPr>
-              <w:t xml:space="preserve">minimatch has ReDoS: matchOne() combinatorial backtracking v</w:t>
-            </w:r>
-          </w:p>
-        </w:tc>
-        <w:tc>
-          <w:tcPr>
-            <w:tcW w:type="pct" w:w="20%"/>
-            <w:shd w:color="FFFFFF" w:val="solid"/>
-          </w:tcPr>
-          <w:p>
-            <w:r>
-              <w:rPr>
-                <w:sz w:val="18"/>
-                <w:szCs w:val="18"/>
-              </w:rPr>
-              <w:t xml:space="preserve">&gt;=10.0.0 &lt;10.2.3</w:t>
-            </w:r>
-          </w:p>
-        </w:tc>
-        <w:tc>
-          <w:tcPr>
-            <w:tcW w:type="pct" w:w="20%"/>
-            <w:shd w:color="FFFFFF" w:val="solid"/>
-          </w:tcPr>
-          <w:p>
-            <w:r>
-              <w:rPr>
-                <w:sz w:val="18"/>
-                <w:szCs w:val="18"/>
-              </w:rPr>
-              <w:t xml:space="preserve">Upgrade @vercel/node to 4.0.0</w:t>
-            </w:r>
-          </w:p>
-        </w:tc>
-      </w:tr>
-      <w:tr>
-        <w:tc>
-          <w:tcPr>
-            <w:tcW w:type="pct" w:w="15%"/>
-            <w:shd w:color="F5F5F5" w:val="solid"/>
-          </w:tcPr>
-          <w:p>
-            <w:r>
-              <w:rPr>
-                <w:sz w:val="18"/>
-                <w:szCs w:val="18"/>
-              </w:rPr>
-              <w:t xml:space="preserve">minimatch</w:t>
-            </w:r>
-          </w:p>
-        </w:tc>
-        <w:tc>
-          <w:tcPr>
-            <w:tcW w:type="pct" w:w="10%"/>
-            <w:shd w:color="F5F5F5" w:val="solid"/>
-          </w:tcPr>
-          <w:p>
-            <w:r>
-              <w:rPr>
-                <w:sz w:val="18"/>
-                <w:szCs w:val="18"/>
-              </w:rPr>
-              <w:t xml:space="preserve">HIGH</w:t>
-            </w:r>
-          </w:p>
-        </w:tc>
-        <w:tc>
-          <w:tcPr>
-            <w:tcW w:type="pct" w:w="35%"/>
-            <w:shd w:color="F5F5F5" w:val="solid"/>
-          </w:tcPr>
-          <w:p>
-            <w:r>
-              <w:rPr>
-                <w:sz w:val="18"/>
-                <w:szCs w:val="18"/>
-              </w:rPr>
-              <w:t xml:space="preserve">minimatch ReDoS: nested *() extglobs generate catastrophical</w:t>
-            </w:r>
-          </w:p>
-        </w:tc>
-        <w:tc>
-          <w:tcPr>
-            <w:tcW w:type="pct" w:w="20%"/>
-            <w:shd w:color="F5F5F5" w:val="solid"/>
-          </w:tcPr>
-          <w:p>
-            <w:r>
-              <w:rPr>
-                <w:sz w:val="18"/>
-                <w:szCs w:val="18"/>
-              </w:rPr>
-              <w:t xml:space="preserve">&lt;3.1.4</w:t>
-            </w:r>
-          </w:p>
-        </w:tc>
-        <w:tc>
-          <w:tcPr>
-            <w:tcW w:type="pct" w:w="20%"/>
-            <w:shd w:color="F5F5F5" w:val="solid"/>
-          </w:tcPr>
-          <w:p>
-            <w:r>
-              <w:rPr>
-                <w:sz w:val="18"/>
-                <w:szCs w:val="18"/>
-              </w:rPr>
-              <w:t xml:space="preserve">Upgrade @vercel/node to 4.0.0</w:t>
-            </w:r>
-          </w:p>
-        </w:tc>
-      </w:tr>
-      <w:tr>
-        <w:tc>
-          <w:tcPr>
-            <w:tcW w:type="pct" w:w="15%"/>
-            <w:shd w:color="FFFFFF" w:val="solid"/>
-          </w:tcPr>
-          <w:p>
-            <w:r>
-              <w:rPr>
-                <w:sz w:val="18"/>
-                <w:szCs w:val="18"/>
-              </w:rPr>
-              <w:t xml:space="preserve">minimatch</w:t>
-            </w:r>
-          </w:p>
-        </w:tc>
-        <w:tc>
-          <w:tcPr>
-            <w:tcW w:type="pct" w:w="10%"/>
-            <w:shd w:color="FFFFFF" w:val="solid"/>
-          </w:tcPr>
-          <w:p>
-            <w:r>
-              <w:rPr>
-                <w:sz w:val="18"/>
-                <w:szCs w:val="18"/>
-              </w:rPr>
-              <w:t xml:space="preserve">HIGH</w:t>
-            </w:r>
-          </w:p>
-        </w:tc>
-        <w:tc>
-          <w:tcPr>
-            <w:tcW w:type="pct" w:w="35%"/>
-            <w:shd w:color="FFFFFF" w:val="solid"/>
-          </w:tcPr>
-          <w:p>
-            <w:r>
-              <w:rPr>
-                <w:sz w:val="18"/>
-                <w:szCs w:val="18"/>
-              </w:rPr>
-              <w:t xml:space="preserve">minimatch ReDoS: nested *() extglobs generate catastrophical</w:t>
-            </w:r>
-          </w:p>
-        </w:tc>
-        <w:tc>
-          <w:tcPr>
-            <w:tcW w:type="pct" w:w="20%"/>
-            <w:shd w:color="FFFFFF" w:val="solid"/>
-          </w:tcPr>
-          <w:p>
-            <w:r>
-              <w:rPr>
-                <w:sz w:val="18"/>
-                <w:szCs w:val="18"/>
-              </w:rPr>
-              <w:t xml:space="preserve">&gt;=9.0.0 &lt;9.0.7</w:t>
-            </w:r>
-          </w:p>
-        </w:tc>
-        <w:tc>
-          <w:tcPr>
-            <w:tcW w:type="pct" w:w="20%"/>
-            <w:shd w:color="FFFFFF" w:val="solid"/>
-          </w:tcPr>
-          <w:p>
-            <w:r>
-              <w:rPr>
-                <w:sz w:val="18"/>
-                <w:szCs w:val="18"/>
-              </w:rPr>
-              <w:t xml:space="preserve">Upgrade @vercel/node to 4.0.0</w:t>
-            </w:r>
-          </w:p>
-        </w:tc>
-      </w:tr>
-      <w:tr>
-        <w:tc>
-          <w:tcPr>
-            <w:tcW w:type="pct" w:w="15%"/>
-            <w:shd w:color="F5F5F5" w:val="solid"/>
-          </w:tcPr>
-          <w:p>
-            <w:r>
-              <w:rPr>
-                <w:sz w:val="18"/>
-                <w:szCs w:val="18"/>
-              </w:rPr>
-              <w:t xml:space="preserve">minimatch</w:t>
-            </w:r>
-          </w:p>
-        </w:tc>
-        <w:tc>
-          <w:tcPr>
-            <w:tcW w:type="pct" w:w="10%"/>
-            <w:shd w:color="F5F5F5" w:val="solid"/>
-          </w:tcPr>
-          <w:p>
-            <w:r>
-              <w:rPr>
-                <w:sz w:val="18"/>
-                <w:szCs w:val="18"/>
-              </w:rPr>
-              <w:t xml:space="preserve">HIGH</w:t>
-            </w:r>
-          </w:p>
-        </w:tc>
-        <w:tc>
-          <w:tcPr>
-            <w:tcW w:type="pct" w:w="35%"/>
-            <w:shd w:color="F5F5F5" w:val="solid"/>
-          </w:tcPr>
-          <w:p>
-            <w:r>
-              <w:rPr>
-                <w:sz w:val="18"/>
-                <w:szCs w:val="18"/>
-              </w:rPr>
-              <w:t xml:space="preserve">minimatch ReDoS: nested *() extglobs generate catastrophical</w:t>
-            </w:r>
-          </w:p>
-        </w:tc>
-        <w:tc>
-          <w:tcPr>
-            <w:tcW w:type="pct" w:w="20%"/>
-            <w:shd w:color="F5F5F5" w:val="solid"/>
-          </w:tcPr>
-          <w:p>
-            <w:r>
-              <w:rPr>
-                <w:sz w:val="18"/>
-                <w:szCs w:val="18"/>
-              </w:rPr>
-              <w:t xml:space="preserve">&gt;=10.0.0 &lt;10.2.3</w:t>
-            </w:r>
-          </w:p>
-        </w:tc>
-        <w:tc>
-          <w:tcPr>
-            <w:tcW w:type="pct" w:w="20%"/>
-            <w:shd w:color="F5F5F5" w:val="solid"/>
-          </w:tcPr>
-          <w:p>
-            <w:r>
-              <w:rPr>
-                <w:sz w:val="18"/>
-                <w:szCs w:val="18"/>
-              </w:rPr>
-              <w:t xml:space="preserve">Upgrade @vercel/node to 4.0.0</w:t>
-            </w:r>
-          </w:p>
-        </w:tc>
-      </w:tr>
-      <w:tr>
-        <w:tc>
-          <w:tcPr>
-            <w:tcW w:type="pct" w:w="15%"/>
-            <w:shd w:color="FFFFFF" w:val="solid"/>
-          </w:tcPr>
-          <w:p>
-            <w:r>
-              <w:rPr>
-                <w:sz w:val="18"/>
-                <w:szCs w:val="18"/>
-              </w:rPr>
-              <w:t xml:space="preserve">path-to-regexp</w:t>
-            </w:r>
-          </w:p>
-        </w:tc>
-        <w:tc>
-          <w:tcPr>
-            <w:tcW w:type="pct" w:w="10%"/>
-            <w:shd w:color="FFFFFF" w:val="solid"/>
-          </w:tcPr>
-          <w:p>
-            <w:r>
-              <w:rPr>
-                <w:sz w:val="18"/>
-                <w:szCs w:val="18"/>
-              </w:rPr>
-              <w:t xml:space="preserve">HIGH</w:t>
-            </w:r>
-          </w:p>
-        </w:tc>
-        <w:tc>
-          <w:tcPr>
-            <w:tcW w:type="pct" w:w="35%"/>
-            <w:shd w:color="FFFFFF" w:val="solid"/>
-          </w:tcPr>
-          <w:p>
-            <w:r>
-              <w:rPr>
-                <w:sz w:val="18"/>
-                <w:szCs w:val="18"/>
-              </w:rPr>
-              <w:t xml:space="preserve">path-to-regexp outputs backtracking regular expressions</w:t>
-            </w:r>
-          </w:p>
-        </w:tc>
-        <w:tc>
-          <w:tcPr>
-            <w:tcW w:type="pct" w:w="20%"/>
-            <w:shd w:color="FFFFFF" w:val="solid"/>
-          </w:tcPr>
-          <w:p>
-            <w:r>
-              <w:rPr>
-                <w:sz w:val="18"/>
-                <w:szCs w:val="18"/>
-              </w:rPr>
-              <w:t xml:space="preserve">&gt;=4.0.0 &lt;6.3.0</w:t>
-            </w:r>
-          </w:p>
-        </w:tc>
-        <w:tc>
-          <w:tcPr>
-            <w:tcW w:type="pct" w:w="20%"/>
-            <w:shd w:color="FFFFFF" w:val="solid"/>
-          </w:tcPr>
-          <w:p>
-            <w:r>
-              <w:rPr>
-                <w:sz w:val="18"/>
-                <w:szCs w:val="18"/>
-              </w:rPr>
-              <w:t xml:space="preserve">Upgrade @vercel/node to 4.0.0</w:t>
-            </w:r>
-          </w:p>
-        </w:tc>
-      </w:tr>
-      <w:tr>
-        <w:tc>
-          <w:tcPr>
-            <w:tcW w:type="pct" w:w="15%"/>
-            <w:shd w:color="F5F5F5" w:val="solid"/>
-          </w:tcPr>
-          <w:p>
-            <w:r>
-              <w:rPr>
-                <w:sz w:val="18"/>
-                <w:szCs w:val="18"/>
-              </w:rPr>
-              <w:t xml:space="preserve">qs</w:t>
-            </w:r>
-          </w:p>
-        </w:tc>
-        <w:tc>
-          <w:tcPr>
-            <w:tcW w:type="pct" w:w="10%"/>
-            <w:shd w:color="F5F5F5" w:val="solid"/>
-          </w:tcPr>
-          <w:p>
-            <w:r>
-              <w:rPr>
-                <w:sz w:val="18"/>
-                <w:szCs w:val="18"/>
-              </w:rPr>
-              <w:t xml:space="preserve">LOW</w:t>
-            </w:r>
-          </w:p>
-        </w:tc>
-        <w:tc>
-          <w:tcPr>
-            <w:tcW w:type="pct" w:w="35%"/>
-            <w:shd w:color="F5F5F5" w:val="solid"/>
-          </w:tcPr>
-          <w:p>
-            <w:r>
-              <w:rPr>
-                <w:sz w:val="18"/>
-                <w:szCs w:val="18"/>
-              </w:rPr>
-              <w:t xml:space="preserve">qs's arrayLimit bypass in comma parsing allows denial of ser</w:t>
-            </w:r>
-          </w:p>
-        </w:tc>
-        <w:tc>
-          <w:tcPr>
-            <w:tcW w:type="pct" w:w="20%"/>
-            <w:shd w:color="F5F5F5" w:val="solid"/>
-          </w:tcPr>
-          <w:p>
-            <w:r>
-              <w:rPr>
-                <w:sz w:val="18"/>
-                <w:szCs w:val="18"/>
-              </w:rPr>
-              <w:t xml:space="preserve">&gt;=6.7.0 &lt;=6.14.1</w:t>
-            </w:r>
-          </w:p>
-        </w:tc>
-        <w:tc>
-          <w:tcPr>
-            <w:tcW w:type="pct" w:w="20%"/>
-            <w:shd w:color="F5F5F5" w:val="solid"/>
-          </w:tcPr>
-          <w:p>
-            <w:r>
-              <w:rPr>
-                <w:sz w:val="18"/>
-                <w:szCs w:val="18"/>
-              </w:rPr>
-              <w:t xml:space="preserve">Yes (run npm audit fix)</w:t>
-            </w:r>
-          </w:p>
-        </w:tc>
-      </w:tr>
-      <w:tr>
-        <w:tc>
-          <w:tcPr>
-            <w:tcW w:type="pct" w:w="15%"/>
-            <w:shd w:color="FFFFFF" w:val="solid"/>
-          </w:tcPr>
-          <w:p>
-            <w:r>
-              <w:rPr>
-                <w:sz w:val="18"/>
-                <w:szCs w:val="18"/>
-              </w:rPr>
-              <w:t xml:space="preserve">rollup</w:t>
-            </w:r>
-          </w:p>
-        </w:tc>
-        <w:tc>
-          <w:tcPr>
-            <w:tcW w:type="pct" w:w="10%"/>
-            <w:shd w:color="FFFFFF" w:val="solid"/>
-          </w:tcPr>
-          <w:p>
-            <w:r>
-              <w:rPr>
-                <w:sz w:val="18"/>
-                <w:szCs w:val="18"/>
-              </w:rPr>
-              <w:t xml:space="preserve">HIGH</w:t>
-            </w:r>
-          </w:p>
-        </w:tc>
-        <w:tc>
-          <w:tcPr>
-            <w:tcW w:type="pct" w:w="35%"/>
-            <w:shd w:color="FFFFFF" w:val="solid"/>
-          </w:tcPr>
-          <w:p>
-            <w:r>
-              <w:rPr>
-                <w:sz w:val="18"/>
-                <w:szCs w:val="18"/>
-              </w:rPr>
-              <w:t xml:space="preserve">Rollup 4 has Arbitrary File Write via Path Traversal</w:t>
-            </w:r>
-          </w:p>
-        </w:tc>
-        <w:tc>
-          <w:tcPr>
-            <w:tcW w:type="pct" w:w="20%"/>
-            <w:shd w:color="FFFFFF" w:val="solid"/>
-          </w:tcPr>
-          <w:p>
-            <w:r>
-              <w:rPr>
-                <w:sz w:val="18"/>
-                <w:szCs w:val="18"/>
-              </w:rPr>
-              <w:t xml:space="preserve">&gt;=4.0.0 &lt;4.59.0</w:t>
-            </w:r>
-          </w:p>
-        </w:tc>
-        <w:tc>
-          <w:tcPr>
-            <w:tcW w:type="pct" w:w="20%"/>
-            <w:shd w:color="FFFFFF" w:val="solid"/>
-          </w:tcPr>
-          <w:p>
-            <w:r>
-              <w:rPr>
-                <w:sz w:val="18"/>
-                <w:szCs w:val="18"/>
-              </w:rPr>
-              <w:t xml:space="preserve">Yes (run npm audit fix)</w:t>
-            </w:r>
-          </w:p>
-        </w:tc>
-      </w:tr>
-      <w:tr>
-        <w:tc>
-          <w:tcPr>
-            <w:tcW w:type="pct" w:w="15%"/>
-            <w:shd w:color="F5F5F5" w:val="solid"/>
-          </w:tcPr>
-          <w:p>
-            <w:r>
-              <w:rPr>
-                <w:sz w:val="18"/>
-                <w:szCs w:val="18"/>
-              </w:rPr>
-              <w:t xml:space="preserve">tar</w:t>
-            </w:r>
-          </w:p>
-        </w:tc>
-        <w:tc>
-          <w:tcPr>
-            <w:tcW w:type="pct" w:w="10%"/>
-            <w:shd w:color="F5F5F5" w:val="solid"/>
-          </w:tcPr>
-          <w:p>
-            <w:r>
-              <w:rPr>
-                <w:sz w:val="18"/>
-                <w:szCs w:val="18"/>
-              </w:rPr>
-              <w:t xml:space="preserve">HIGH</w:t>
-            </w:r>
-          </w:p>
-        </w:tc>
-        <w:tc>
-          <w:tcPr>
-            <w:tcW w:type="pct" w:w="35%"/>
-            <w:shd w:color="F5F5F5" w:val="solid"/>
-          </w:tcPr>
-          <w:p>
-            <w:r>
-              <w:rPr>
-                <w:sz w:val="18"/>
-                <w:szCs w:val="18"/>
-              </w:rPr>
-              <w:t xml:space="preserve">Arbitrary File Read/Write via Hardlink Target Escape Through</w:t>
-            </w:r>
-          </w:p>
-        </w:tc>
-        <w:tc>
-          <w:tcPr>
-            <w:tcW w:type="pct" w:w="20%"/>
-            <w:shd w:color="F5F5F5" w:val="solid"/>
-          </w:tcPr>
-          <w:p>
-            <w:r>
-              <w:rPr>
-                <w:sz w:val="18"/>
-                <w:szCs w:val="18"/>
-              </w:rPr>
-              <w:t xml:space="preserve">&lt;7.5.8</w:t>
-            </w:r>
-          </w:p>
-        </w:tc>
-        <w:tc>
-          <w:tcPr>
-            <w:tcW w:type="pct" w:w="20%"/>
-            <w:shd w:color="F5F5F5" w:val="solid"/>
-          </w:tcPr>
-          <w:p>
-            <w:r>
-              <w:rPr>
-                <w:sz w:val="18"/>
-                <w:szCs w:val="18"/>
-              </w:rPr>
-              <w:t xml:space="preserve">Yes (run npm audit fix)</w:t>
             </w:r>
           </w:p>
         </w:tc>
@@ -9089,7 +8105,7 @@
                 <w:sz w:val="18"/>
                 <w:szCs w:val="18"/>
               </w:rPr>
-              <w:t xml:space="preserve">FAIL</w:t>
+              <w:t xml:space="preserve">PASS</w:t>
             </w:r>
           </w:p>
         </w:tc>
@@ -9104,7 +8120,7 @@
                 <w:sz w:val="18"/>
                 <w:szCs w:val="18"/>
               </w:rPr>
-              <w:t xml:space="preserve">Medium</w:t>
+              <w:t xml:space="preserve">None</w:t>
             </w:r>
           </w:p>
         </w:tc>
@@ -9893,7 +8909,7 @@
           <w:sz w:val="16"/>
           <w:szCs w:val="16"/>
         </w:rPr>
-        <w:t xml:space="preserve">Report generated: 2026-03-03T16:23:49.352Z  |  EDMECA Digital Academy  |  X4O Consulting</w:t>
+        <w:t xml:space="preserve">Report generated: 2026-03-03T16:39:11.292Z  |  EDMECA Digital Academy  |  X4O Consulting</w:t>
       </w:r>
     </w:p>
     <w:sectPr>

</xml_diff>